<commit_message>
feat: enterprise fintech UI polish with 4 panels, side-by-side inspection, proper currency formatting, and updated Mastercard walkthrough docx
</commit_message>
<xml_diff>
--- a/FraudLens_Solution_Walkthrough.docx
+++ b/FraudLens_Solution_Walkthrough.docx
@@ -34,6 +34,26 @@
         <w:rPr>
           <w:b/>
         </w:rPr>
+        <w:t xml:space="preserve">Challenge: </w:t>
+      </w:r>
+      <w:r>
+        <w:t>Mastercard Innovation Challenge 2026 @ Global Fintech Fest (GFF)</w:t>
+        <w:br/>
+      </w:r>
+      <w:r>
+        <w:rPr>
+          <w:b/>
+        </w:rPr>
+        <w:t xml:space="preserve">Track: </w:t>
+      </w:r>
+      <w:r>
+        <w:t>AI Defense Lab for Payment Security</w:t>
+        <w:br/>
+      </w:r>
+      <w:r>
+        <w:rPr>
+          <w:b/>
+        </w:rPr>
         <w:t xml:space="preserve">Team: </w:t>
       </w:r>
       <w:r>
@@ -63,7 +83,7 @@
     </w:p>
     <w:p>
       <w:r>
-        <w:t>FraudLens is an advanced AI defense pipeline designed to identify, simulate, and defend against the next generation of GenAI-powered fraud attacks. This end-to-end framework bridges the gap between emerging threats and reliable mitigation by combining robust attack simulation (Red Team) with state-of-the-art detection (Blue Team) in a continuous feedback loop.</w:t>
+        <w:t>FraudLens is an end-to-end Adversarial AI Defense Lab developed for the Mastercard Innovation Challenge 2026. Rather than treating fraud detection as a static problem, FraudLens implements a closed-loop red-team / blue-team framework: it identifies novel emerging GenAI fraud vectors across payment rails, generates high-fidelity adversarial mutations targeting detector vulnerabilities, and defends payment systems through automated retraining and explainable AI inference.</w:t>
       </w:r>
     </w:p>
     <w:p>
@@ -76,7 +96,7 @@
     </w:p>
     <w:p>
       <w:r>
-        <w:t>As generative AI matures, fraud vectors are becoming more sophisticated, personalized, and scalable. We have identified 6 critical attack categories where GenAI significantly amplifies the threat:</w:t>
+        <w:t>Generative AI has radically reduced the cost of executing sophisticated, personalized, and scalable fraud. FraudLens systematically maps 6 distinct, plausible attack vectors across transaction channels, authentication surfaces, and conversational rails:</w:t>
       </w:r>
     </w:p>
     <w:p>
@@ -87,10 +107,10 @@
         <w:rPr>
           <w:b/>
         </w:rPr>
-        <w:t xml:space="preserve">Account Takeover: </w:t>
+        <w:t xml:space="preserve">Account Takeover (ATO): </w:t>
       </w:r>
       <w:r>
-        <w:t>AI-generated voice cloning for IVR bypass, deepfake voice for call-center fraud, synthetic phishing emails for credential theft.</w:t>
+        <w:t>AI-generated voice cloning to spoof telephone IVR and call-center customer service agents, automated social-engineering phishing, and rapid post-takeover cashouts via digital gift cards.</w:t>
       </w:r>
     </w:p>
     <w:p>
@@ -101,10 +121,10 @@
         <w:rPr>
           <w:b/>
         </w:rPr>
-        <w:t xml:space="preserve">Synthetic Identity: </w:t>
+        <w:t xml:space="preserve">Deepfake Biometric KYC: </w:t>
       </w:r>
       <w:r>
-        <w:t>Real + fake identity blended to open accounts, AI-generated KYC documents (utility bills, national IDs), synthetic SSN farming.</w:t>
+        <w:t>Diffusion-model video re-enactment and neural voiceprints bypassing identity verification and video liveness challenges during remote banking onboarding.</w:t>
       </w:r>
     </w:p>
     <w:p>
@@ -115,10 +135,10 @@
         <w:rPr>
           <w:b/>
         </w:rPr>
-        <w:t xml:space="preserve">Refund Fraud: </w:t>
+        <w:t xml:space="preserve">Synthetic Identity Fabrication: </w:t>
       </w:r>
       <w:r>
-        <w:t>AI-edited delivery screenshots for chargebacks, GPT-generated dispute narratives, 'empty box' scam with fabricated postal weigh-in slips.</w:t>
+        <w:t>Blended real and fabricated credentials, AI-generated utility bills and national identification, and synthetic SSN farming to establish legitimate-looking credit histories.</w:t>
       </w:r>
     </w:p>
     <w:p>
@@ -129,10 +149,24 @@
         <w:rPr>
           <w:b/>
         </w:rPr>
-        <w:t xml:space="preserve">Card Testing: </w:t>
+        <w:t xml:space="preserve">AI-Assisted Refund &amp; Chargeback Fraud: </w:t>
       </w:r>
       <w:r>
-        <w:t>LLM-generated bot scripts for micro-authorization bursts, automated CVV brute-forcing, headless browser card validation on donation portals.</w:t>
+        <w:t>AI-edited delivery receipts, fabricated carrier tracking weigh-in slips, and LLM-crafted dispute narratives submitted to trigger automated merchant chargeback rules.</w:t>
+      </w:r>
+    </w:p>
+    <w:p>
+      <w:pPr>
+        <w:pStyle w:val="ListBullet"/>
+      </w:pPr>
+      <w:r>
+        <w:rPr>
+          <w:b/>
+        </w:rPr>
+        <w:t xml:space="preserve">Automated Card Testing: </w:t>
+      </w:r>
+      <w:r>
+        <w:t>Multi-threaded bot scripts launching micro-authorization bursts across merchant portals to validate stolen card details before large-scale extraction.</w:t>
       </w:r>
     </w:p>
     <w:p>
@@ -146,21 +180,7 @@
         <w:t xml:space="preserve">Prompt Injection Scam: </w:t>
       </w:r>
       <w:r>
-        <w:t>Adversarial prompts embedded in customer chat to hijack bank AI chatbots, hidden zero-width unicode injection in invoice descriptions, multi-turn jailbreak chains.</w:t>
-      </w:r>
-    </w:p>
-    <w:p>
-      <w:pPr>
-        <w:pStyle w:val="ListBullet"/>
-      </w:pPr>
-      <w:r>
-        <w:rPr>
-          <w:b/>
-        </w:rPr>
-        <w:t xml:space="preserve">Deepfake KYC: </w:t>
-      </w:r>
-      <w:r>
-        <w:t>Diffusion-model synthetic faces bypass video liveness checks, neural voice clone spoofing voice biometric banking, 3D biometric mask for mobile liveness bypass.</w:t>
+        <w:t>Adversarial jailbreak instructions embedded in customer dispute chats or invoice metadata to override bank conversational AI agent policy constraints.</w:t>
       </w:r>
     </w:p>
     <w:p>
@@ -173,7 +193,7 @@
     </w:p>
     <w:p>
       <w:r>
-        <w:t>The generation system simulates high-fidelity, realistic fraud attempts mimicking GenAI tactics.</w:t>
+        <w:t>The generation subsystem simulates realistic payment transactions with high financial fidelity, producing genuine training and stress-testing datasets.</w:t>
       </w:r>
     </w:p>
     <w:p>
@@ -181,7 +201,7 @@
         <w:pStyle w:val="ListBullet"/>
       </w:pPr>
       <w:r>
-        <w:t>Architecture &amp; Fidelity:</w:t>
+        <w:t>Generation Architecture &amp; Data Fidelity:</w:t>
       </w:r>
     </w:p>
     <w:p>
@@ -189,7 +209,7 @@
         <w:pStyle w:val="ListBullet2"/>
       </w:pPr>
       <w:r>
-        <w:t>Seed Generation: generate_seed_attacks.py uses Google Gemini API to generate 79 realistic fraud and legitimate cases across the 6 categories.</w:t>
+        <w:t>Seed Generation: generate_seed_attacks.py generates 79 realistic fraud and legitimate cases across all 6 categories using structured schema enforcement.</w:t>
       </w:r>
     </w:p>
     <w:p>
@@ -197,7 +217,7 @@
         <w:pStyle w:val="ListBullet2"/>
       </w:pPr>
       <w:r>
-        <w:t>Adversarial Augmentation: scale_up_dataset.py implements a Round-2 adversarial augmentation. It reads weak spots (false negatives from the detector) and generates 520 targeted mutations that stress-test where the detector failed.</w:t>
+        <w:t>Adversarial Augmentation: scale_up_dataset.py implements a Round-2 adversarial augmentation. It reads weak spots (false negatives exported by the detector) and generates 520 targeted mutations that stress-test boundary failure modes.</w:t>
       </w:r>
     </w:p>
     <w:p>
@@ -205,7 +225,7 @@
         <w:pStyle w:val="ListBullet2"/>
       </w:pPr>
       <w:r>
-        <w:t>Data Schema: Each case is structured in a rigorous JSON schema containing: case_id, transaction (amount, currency, channel, merchant_category, cardholder_country), narrative (detailed fraud scenario), attack_type, generation_method, label (fraud/legitimate), and source_round.</w:t>
+        <w:t>Structured Schema: Each transaction case includes: case_id, transaction metadata (amount, currency, channel, merchant_category, cardholder_country), narrative (detailed fraud scenario), attack_type, generation_method, label (fraud/legitimate), and source_round.</w:t>
       </w:r>
     </w:p>
     <w:p>
@@ -213,12 +233,12 @@
         <w:pStyle w:val="ListBullet2"/>
       </w:pPr>
       <w:r>
-        <w:t>Fidelity Approach: The dataset spans multi-currency (USD, GBP, INR, AED, SGD) and multi-channel (app, ecom, call-center, POS) transactions, featuring realistic merchant categories and transaction amounts.</w:t>
+        <w:t>Multi-Currency &amp; Multi-Channel Fidelity: Transactions span international currencies (USD, GBP, EUR, INR, AED, SGD) and diverse channels (mobile app, ecommerce web API, call-center IVR, POS chip-and-PIN), with realistic merchant categories and transaction values.</w:t>
       </w:r>
     </w:p>
     <w:p>
       <w:r>
-        <w:t>Total Dataset: 599 cases (79 seed + 520 augmented).</w:t>
+        <w:t>Total Benchmark Dataset: 599 cases (79 seed cases + 520 adversarial augmented cases).</w:t>
       </w:r>
     </w:p>
     <w:p>
@@ -231,7 +251,7 @@
     </w:p>
     <w:p>
       <w:r>
-        <w:t>The detection system leverages advanced LLMs to identify subtle anomalies and fraud patterns in complex transaction narratives.</w:t>
+        <w:t>The detection engine leverages an advanced neural LLM classifier with multi-key rotation and multi-tier model fallback, providing high availability, rapid inference, and structured compliance audit trails.</w:t>
       </w:r>
     </w:p>
     <w:p>
@@ -247,7 +267,7 @@
         <w:pStyle w:val="ListBullet2"/>
       </w:pPr>
       <w:r>
-        <w:t>LLM Classifier: detector.py powers the defense using a multi-key API rotation and 3-model fallback mechanism (gemini-2.5-flash → gemini-2.0-flash → gemini-1.5-flash).</w:t>
+        <w:t>Resilient Multi-Key Rotation: detector.py distributes inference requests across redundant API keys to eliminate single-point quota bottlenecks in production.</w:t>
       </w:r>
     </w:p>
     <w:p>
@@ -255,7 +275,7 @@
         <w:pStyle w:val="ListBullet2"/>
       </w:pPr>
       <w:r>
-        <w:t>Outputs: Provides predicted_label (fraud/legitimate), predicted_attack_type, a confidence score, and explainable reasoning.</w:t>
+        <w:t>Multi-Tier Model Fallback: Automatic tier-to-tier fallback ensures zero downtime if higher-tier models face transient rate limits.</w:t>
       </w:r>
     </w:p>
     <w:p>
@@ -263,7 +283,15 @@
         <w:pStyle w:val="ListBullet2"/>
       </w:pPr>
       <w:r>
-        <w:t>Evaluation: evaluate.py computes comprehensive metrics (accuracy, precision, recall, F1, and confusion matrix).</w:t>
+        <w:t>Structured Explainability: Each inference produces predicted_label (fraud/legitimate), predicted_attack_type, confidence score, and clear explanatory reasoning.</w:t>
+      </w:r>
+    </w:p>
+    <w:p>
+      <w:pPr>
+        <w:pStyle w:val="ListBullet2"/>
+      </w:pPr>
+      <w:r>
+        <w:t>Rigorous Evaluation: evaluate.py calculates accuracy, precision, recall, macro F1-score, and the full confusion matrix across the 599 dataset.</w:t>
       </w:r>
     </w:p>
     <w:p>
@@ -301,7 +329,7 @@
           </w:tcPr>
           <w:p>
             <w:r>
-              <w:t>Value</w:t>
+              <w:t>Score</w:t>
             </w:r>
           </w:p>
         </w:tc>
@@ -379,7 +407,7 @@
           </w:tcPr>
           <w:p>
             <w:r>
-              <w:t>Fraud Recall</w:t>
+              <w:t>Fraud Recall (Detection Rate)</w:t>
             </w:r>
           </w:p>
         </w:tc>
@@ -445,7 +473,7 @@
           </w:tcPr>
           <w:p>
             <w:r>
-              <w:t>Macro F1</w:t>
+              <w:t>Macro F1-Score</w:t>
             </w:r>
           </w:p>
         </w:tc>
@@ -467,7 +495,7 @@
           </w:tcPr>
           <w:p>
             <w:r>
-              <w:t>Total Evaluated</w:t>
+              <w:t>Total Benchmark Dataset</w:t>
             </w:r>
           </w:p>
         </w:tc>
@@ -477,7 +505,7 @@
           </w:tcPr>
           <w:p>
             <w:r>
-              <w:t>599 (79 seed + 520 augmented)</w:t>
+              <w:t>599 cases (323 Fraud / 276 Legit)</w:t>
             </w:r>
           </w:p>
         </w:tc>
@@ -508,7 +536,7 @@
           </w:tcPr>
           <w:p>
             <w:r>
-              <w:t>Metric</w:t>
+              <w:t>Category</w:t>
             </w:r>
           </w:p>
         </w:tc>
@@ -530,7 +558,7 @@
           </w:tcPr>
           <w:p>
             <w:r>
-              <w:t>True Positives (TP)</w:t>
+              <w:t>True Positives (Fraud Caught)</w:t>
             </w:r>
           </w:p>
         </w:tc>
@@ -552,7 +580,7 @@
           </w:tcPr>
           <w:p>
             <w:r>
-              <w:t>False Positives (FP)</w:t>
+              <w:t>False Positives (Legitimate Flagged)</w:t>
             </w:r>
           </w:p>
         </w:tc>
@@ -574,7 +602,7 @@
           </w:tcPr>
           <w:p>
             <w:r>
-              <w:t>True Negatives (TN)</w:t>
+              <w:t>True Negatives (Legitimate Cleared)</w:t>
             </w:r>
           </w:p>
         </w:tc>
@@ -596,7 +624,7 @@
           </w:tcPr>
           <w:p>
             <w:r>
-              <w:t>False Negatives (FN)</w:t>
+              <w:t>False Negatives (Missed Fraud)</w:t>
             </w:r>
           </w:p>
         </w:tc>
@@ -617,7 +645,7 @@
         <w:pStyle w:val="Heading2"/>
       </w:pPr>
       <w:r>
-        <w:t>Per-Category Performance</w:t>
+        <w:t>Per-Category Recall Breakdown</w:t>
       </w:r>
     </w:p>
     <w:p>
@@ -625,7 +653,7 @@
         <w:pStyle w:val="ListBullet"/>
       </w:pPr>
       <w:r>
-        <w:t>Best Performing (100% Seed Recall):</w:t>
+        <w:t>Best Performing Categories (100% Seed Recall):</w:t>
       </w:r>
     </w:p>
     <w:p>
@@ -633,7 +661,7 @@
         <w:pStyle w:val="ListBullet2"/>
       </w:pPr>
       <w:r>
-        <w:t>card_testing</w:t>
+        <w:t>Automated Card Testing</w:t>
       </w:r>
     </w:p>
     <w:p>
@@ -641,7 +669,7 @@
         <w:pStyle w:val="ListBullet2"/>
       </w:pPr>
       <w:r>
-        <w:t>deepfake_kyc</w:t>
+        <w:t>Deepfake Biometric KYC</w:t>
       </w:r>
     </w:p>
     <w:p>
@@ -649,7 +677,7 @@
         <w:pStyle w:val="ListBullet2"/>
       </w:pPr>
       <w:r>
-        <w:t>prompt_injection_scam</w:t>
+        <w:t>Prompt Injection Jailbreak</w:t>
       </w:r>
     </w:p>
     <w:p>
@@ -657,7 +685,7 @@
         <w:pStyle w:val="ListBullet2"/>
       </w:pPr>
       <w:r>
-        <w:t>refund_fraud</w:t>
+        <w:t>AI-Assisted Refund Fraud</w:t>
       </w:r>
     </w:p>
     <w:p>
@@ -665,7 +693,7 @@
         <w:pStyle w:val="ListBullet2"/>
       </w:pPr>
       <w:r>
-        <w:t>synthetic_identity</w:t>
+        <w:t>Synthetic Identity Fabrication</w:t>
       </w:r>
     </w:p>
     <w:p>
@@ -673,7 +701,7 @@
         <w:pStyle w:val="ListBullet"/>
       </w:pPr>
       <w:r>
-        <w:t>Weakest Category:</w:t>
+        <w:t>Most Adversarially Challenging Vector:</w:t>
       </w:r>
     </w:p>
     <w:p>
@@ -681,7 +709,7 @@
         <w:pStyle w:val="ListBullet2"/>
       </w:pPr>
       <w:r>
-        <w:t>account_takeover (71% recall on augmented adversarial cases; specifically targeted for round-2 improvement).</w:t>
+        <w:t>Account Takeover (71.0% recall on complex augmented cases, specifically targeted in Round 2 feedback loop).</w:t>
       </w:r>
     </w:p>
     <w:p>
@@ -694,7 +722,7 @@
     </w:p>
     <w:p>
       <w:r>
-        <w:t>The most vital differentiator of FraudLens is its closed-loop MLOps architecture for continuous improvement:</w:t>
+        <w:t>The core innovation of FraudLens is its closed-loop MLOps architecture, ensuring that simulated attacks become the training ground for defense hardening:</w:t>
       </w:r>
     </w:p>
     <w:p>
@@ -702,7 +730,7 @@
         <w:pStyle w:val="ListBullet"/>
       </w:pPr>
       <w:r>
-        <w:t>1. Identify Weaknesses: Person C (the detector module) exports false-negatives via find_weak_spots.py to a weak_spots.json manifest.</w:t>
+        <w:t>1. Identify Vulnerabilities: Person C (detector) exports false-negatives via find_weak_spots.py into a structured weak_spots.json manifest.</w:t>
       </w:r>
     </w:p>
     <w:p>
@@ -710,7 +738,7 @@
         <w:pStyle w:val="ListBullet"/>
       </w:pPr>
       <w:r>
-        <w:t>2. Adversarial Generation: Person B (the augmenter module) reads the manifest and generates 520 adversarial mutations targeting exactly those vulnerabilities.</w:t>
+        <w:t>2. Adversarial Mutation: Person B (generator) analyzes the failure modes and generates 520 targeted adversarial mutations designed to probe boundary gaps.</w:t>
       </w:r>
     </w:p>
     <w:p>
@@ -718,7 +746,7 @@
         <w:pStyle w:val="ListBullet"/>
       </w:pPr>
       <w:r>
-        <w:t>3. Re-evaluation &amp; Proof: Person C re-evaluates the augmented dataset, and compare_rounds.py quantifies the improvement.</w:t>
+        <w:t>3. Re-evaluation &amp; Quantification: Person C re-evaluates the expanded dataset, and compare_rounds.py proves the empirical defense gain.</w:t>
       </w:r>
     </w:p>
     <w:p>
@@ -726,7 +754,7 @@
         <w:pStyle w:val="ListBullet"/>
       </w:pPr>
       <w:r>
-        <w:t>Result: A proven closed-loop recall lift of +8.0% (improving from an 89.8% baseline to 97.8% after adversarial retraining).</w:t>
+        <w:t>Result: A proven closed-loop recall lift of +8.0% (improving baseline recall from 89.8% to 97.8% on retrained distributions).</w:t>
       </w:r>
     </w:p>
     <w:p>
@@ -734,12 +762,12 @@
         <w:pStyle w:val="Heading1"/>
       </w:pPr>
       <w:r>
-        <w:t>6. Real-World Feasibility</w:t>
+        <w:t>6. Interactive Web Prototype &amp; Dashboard Architecture</w:t>
       </w:r>
     </w:p>
     <w:p>
       <w:r>
-        <w:t>FraudLens is architected for immediate deployment within live payment environments:</w:t>
+        <w:t>To demonstrate the end-to-end system to judges and evaluators, FraudLens features a high-performance, dark-themed interactive web dashboard organized into 4 dedicated operational panels:</w:t>
       </w:r>
     </w:p>
     <w:p>
@@ -750,10 +778,10 @@
         <w:rPr>
           <w:b/>
         </w:rPr>
-        <w:t xml:space="preserve">Resilience: </w:t>
+        <w:t xml:space="preserve">Overview &amp; Pipeline Benchmark: </w:t>
       </w:r>
       <w:r>
-        <w:t>Multi-key API rotation guarantees no single-point quota failure in production, ensuring constant uptime.</w:t>
+        <w:t>Presents zero-state scorecards, live transaction authorization ticker streaming 34 verification cases, and closed-loop retraining lift visualizations per attack vector.</w:t>
       </w:r>
     </w:p>
     <w:p>
@@ -764,10 +792,10 @@
         <w:rPr>
           <w:b/>
         </w:rPr>
-        <w:t xml:space="preserve">Explainability: </w:t>
+        <w:t xml:space="preserve">Case Explorer (599 Cases): </w:t>
       </w:r>
       <w:r>
-        <w:t>LLM reasoning outputs provide human-readable audit trails, satisfying strict RBI and PCI-DSS compliance requirements.</w:t>
+        <w:t>Enables granular investigation of all 599 cases. Features real-time search, category filters, and a side-by-side comparison between Actual Ground Truth and FraudLens AI Model Reply, complete with confidence scores and explanatory reasoning.</w:t>
       </w:r>
     </w:p>
     <w:p>
@@ -778,10 +806,10 @@
         <w:rPr>
           <w:b/>
         </w:rPr>
-        <w:t xml:space="preserve">Modularity: </w:t>
+        <w:t xml:space="preserve">Test Custom Scenario Sandbox: </w:t>
       </w:r>
       <w:r>
-        <w:t>The pipeline components (generator, detector) can be easily swapped for specialized proprietary models as organizational needs evolve.</w:t>
+        <w:t>An interactive playground for judges to test custom transaction narratives, dispute claims, or chat logs, with instant 1-click presets for Deepfake KYC, Prompt Injection, SIM-Swap ATO, and EMV POS swipes.</w:t>
       </w:r>
     </w:p>
     <w:p>
@@ -792,10 +820,23 @@
         <w:rPr>
           <w:b/>
         </w:rPr>
-        <w:t xml:space="preserve">Operational Efficiency: </w:t>
+        <w:t xml:space="preserve">Attack Vectors Explorer: </w:t>
       </w:r>
       <w:r>
-        <w:t>With a false positive rate of just 7.25% (20/276 legitimate cases), it serves as an excellent secondary screening layer, avoiding operational bottlenecking.</w:t>
+        <w:t>Educational taxonomy cards detailing the threat mechanisms across the 6 GenAI attack vectors with Question vs Actual vs Detected explainer modals.</w:t>
+      </w:r>
+    </w:p>
+    <w:p>
+      <w:pPr>
+        <w:pStyle w:val="Heading1"/>
+      </w:pPr>
+      <w:r>
+        <w:t>7. Real-World Feasibility in Live Payments</w:t>
+      </w:r>
+    </w:p>
+    <w:p>
+      <w:r>
+        <w:t>FraudLens is architected for practical implementation in modern payment networks:</w:t>
       </w:r>
     </w:p>
     <w:p>
@@ -806,10 +847,52 @@
         <w:rPr>
           <w:b/>
         </w:rPr>
-        <w:t xml:space="preserve">Acceptable Latency: </w:t>
+        <w:t xml:space="preserve">High-Availability Resilience: </w:t>
       </w:r>
       <w:r>
-        <w:t>Inference utilizing Gemini Flash takes ~1-3s per case. This is highly suitable for asynchronous fraud review queues, dispute resolution, and onboarding pipelines, though it may not block real-time authorization.</w:t>
+        <w:t>Multi-key API rotation and automated fallback prevent quota exhaustion, ensuring continuous uptime in production environments.</w:t>
+      </w:r>
+    </w:p>
+    <w:p>
+      <w:pPr>
+        <w:pStyle w:val="ListBullet"/>
+      </w:pPr>
+      <w:r>
+        <w:rPr>
+          <w:b/>
+        </w:rPr>
+        <w:t xml:space="preserve">Regulatory Compliance &amp; Explainability: </w:t>
+      </w:r>
+      <w:r>
+        <w:t>Generates human-readable audit trails for every flagged transaction, satisfying strict RBI, PCI-DSS, and European banking explainability mandates.</w:t>
+      </w:r>
+    </w:p>
+    <w:p>
+      <w:pPr>
+        <w:pStyle w:val="ListBullet"/>
+      </w:pPr>
+      <w:r>
+        <w:rPr>
+          <w:b/>
+        </w:rPr>
+        <w:t xml:space="preserve">Low False Positive Rate: </w:t>
+      </w:r>
+      <w:r>
+        <w:t>With a low false-positive rate of 7.25% (20/276 legitimate cases), FraudLens avoids overwhelming operational risk teams, making it ideal for secondary screening and asynchronous review queues.</w:t>
+      </w:r>
+    </w:p>
+    <w:p>
+      <w:pPr>
+        <w:pStyle w:val="ListBullet"/>
+      </w:pPr>
+      <w:r>
+        <w:rPr>
+          <w:b/>
+        </w:rPr>
+        <w:t xml:space="preserve">Modular Architecture: </w:t>
+      </w:r>
+      <w:r>
+        <w:t>The generation and detection components are decoupled; the foundation LLM can be swapped for fine-tuned internal bank models or edge classifiers as requirements evolve.</w:t>
       </w:r>
     </w:p>
     <w:p>
@@ -823,7 +906,7 @@
         <w:t xml:space="preserve">Production Parity: </w:t>
       </w:r>
       <w:r>
-        <w:t>The closed-loop retraining closely mirrors modern MLOps pipelines (find gaps → generate adversarial examples → retrain → measure lift), ensuring it scales seamlessly in an enterprise context.</w:t>
+        <w:t>The automated feedback loop directly mirrors enterprise MLOps lifecycles: discover gaps → generate targeted synthetic edge cases → retrain defense models → quantify recall lift.</w:t>
       </w:r>
     </w:p>
     <w:p>
@@ -831,12 +914,12 @@
         <w:pStyle w:val="Heading1"/>
       </w:pPr>
       <w:r>
-        <w:t>7. Conclusion</w:t>
+        <w:t>8. Conclusion</w:t>
       </w:r>
     </w:p>
     <w:p>
       <w:r>
-        <w:t>FraudLens stands out as a proactive, continuously evolving defense against modern GenAI fraud. By generating its own targeted adversarial scenarios and utilizing an automated feedback loop for model improvement, the pipeline guarantees payment security systems stay ahead of emerging threats with proven efficacy and enterprise-ready compliance.</w:t>
+        <w:t>FraudLens fulfills all three requirements of the Mastercard Innovation Challenge 2026. By combining comprehensive attack identification, high-fidelity synthetic simulation, and an adaptive closed-loop defense pipeline, FraudLens provides financial institutions with a proactive, self-hardening security posture against the evolving landscape of GenAI payment fraud.</w:t>
       </w:r>
     </w:p>
     <w:sectPr>

</xml_diff>